<commit_message>
Rename Product→Project Haus in suite docs; auto-award Set Sail on journey entry
- Set Sail badge now auto-awards on reaching the (gated) journey page
- "Product Haus" → "Project Haus" in the two suite Word docs (Overview ×7,
  Complete Reference ×4), matching the code + reference-doc rename

Co-Authored-By: Claude Opus 4.8 <noreply@anthropic.com>
</commit_message>
<xml_diff>
--- a/The AI Creator's Prompt Haus Suite - Complete Reference.docx
+++ b/The AI Creator's Prompt Haus Suite - Complete Reference.docx
@@ -138,7 +138,7 @@
           <w:sz w:val="22"/>
           <w:szCs w:val="22"/>
         </w:rPr>
-        <w:t xml:space="preserve">Product Haus — where that asset becomes a sellable printable or digital product (planners, journals, coloring books, cards, checklists).</w:t>
+        <w:t xml:space="preserve">Project Haus — where that asset becomes a sellable printable or digital product (planners, journals, coloring books, cards, checklists).</w:t>
       </w:r>
     </w:p>
     <w:p>
@@ -562,7 +562,7 @@
         <w:spacing w:after="200" w:before="480"/>
       </w:pPr>
       <w:r>
-        <w:t xml:space="preserve">Product Haus</w:t>
+        <w:t xml:space="preserve">Project Haus</w:t>
       </w:r>
     </w:p>
     <w:p>
@@ -1444,7 +1444,7 @@
           <w:sz w:val="22"/>
           <w:szCs w:val="22"/>
         </w:rPr>
-        <w:t xml:space="preserve">Up to 3 saved identities (colors, fonts, mood, voice, values, mission), shareable into Marketing Haus and Graphics Haus/Product Haus's own Brand Kits.</w:t>
+        <w:t xml:space="preserve">Up to 3 saved identities (colors, fonts, mood, voice, values, mission), shareable into Marketing Haus and Graphics Haus/Project Haus's own Brand Kits.</w:t>
       </w:r>
     </w:p>
     <w:p>
@@ -1498,7 +1498,7 @@
           <w:sz w:val="22"/>
           <w:szCs w:val="22"/>
         </w:rPr>
-        <w:t xml:space="preserve">No single Haus is required to use another — each is independently purchasable and useful entirely on its own — but they're built to reinforce each other: a Business Name typed once in Brand Haus can show up correctly in a Media Kit generated in Marketing Haus; a Look locked while building one coloring page in Product Haus carries into the next; a character built in Content Haus's Character Mode is exactly what's already loaded when that same creator switches to Combined Mode.</w:t>
+        <w:t xml:space="preserve">No single Haus is required to use another — each is independently purchasable and useful entirely on its own — but they're built to reinforce each other: a Business Name typed once in Brand Haus can show up correctly in a Media Kit generated in Marketing Haus; a Look locked while building one coloring page in Project Haus carries into the next; a character built in Content Haus's Character Mode is exactly what's already loaded when that same creator switches to Combined Mode.</w:t>
       </w:r>
     </w:p>
     <w:sectPr>

</xml_diff>